<commit_message>
docs: fill questionnaire rows answered by the rights holder
Patent certificate, domain paperwork, lease and distribution method are
now recorded; IP transfer documents marked as not yet prepared.

Co-Authored-By: Claude Opus 5 <noreply@anthropic.com>
Claude-Session: https://claude.ai/code/session_01A41GNd7NTYjRMreRZZDvYy
</commit_message>
<xml_diff>
--- a/infosreda-anketa.docx
+++ b/infosreda-anketa.docx
@@ -258,10 +258,26 @@
             <w:r>
               <w:rPr>
                 <w:rFonts w:ascii="Times New Roman" w:eastAsia="Times New Roman" w:hAnsi="Times New Roman" w:cs="Times New Roman"/>
+                <w:lang w:eastAsia="ru-RU"/>
+              </w:rPr>
+              <w:t xml:space="preserve">Установочный пакет формата NSIS для операционной системы Windows размещается в файловом хранилище, доступ — по прямой ссылке на скачивание.</w:t>
+            </w:r>
+          </w:p>
+          <w:p>
+            <w:pPr>
+              <w:spacing w:line="276" w:lineRule="auto"/>
+              <w:rPr>
+                <w:rFonts w:ascii="Times New Roman" w:eastAsia="Times New Roman" w:hAnsi="Times New Roman" w:cs="Times New Roman"/>
+                <w:lang w:eastAsia="ru-RU"/>
+              </w:rPr>
+            </w:pPr>
+            <w:r>
+              <w:rPr>
+                <w:rFonts w:ascii="Times New Roman" w:eastAsia="Times New Roman" w:hAnsi="Times New Roman" w:cs="Times New Roman"/>
                 <w:highlight w:val="yellow"/>
                 <w:lang w:eastAsia="ru-RU"/>
               </w:rPr>
-              <w:t xml:space="preserve">требуется ответ</w:t>
+              <w:t xml:space="preserve">Прямая ссылка указывается при подаче заявления.</w:t>
             </w:r>
           </w:p>
         </w:tc>
@@ -280,10 +296,9 @@
             <w:r>
               <w:rPr>
                 <w:rFonts w:ascii="Times New Roman" w:eastAsia="Times New Roman" w:hAnsi="Times New Roman" w:cs="Times New Roman"/>
-                <w:highlight w:val="yellow"/>
-                <w:lang w:eastAsia="ru-RU"/>
-              </w:rPr>
-              <w:t xml:space="preserve">требуется ответ</w:t>
+                <w:lang w:eastAsia="ru-RU"/>
+              </w:rPr>
+              <w:t xml:space="preserve">да</w:t>
             </w:r>
           </w:p>
         </w:tc>
@@ -469,10 +484,26 @@
             <w:r>
               <w:rPr>
                 <w:rFonts w:ascii="Times New Roman" w:eastAsia="Times New Roman" w:hAnsi="Times New Roman" w:cs="Times New Roman"/>
+                <w:lang w:eastAsia="ru-RU"/>
+              </w:rPr>
+              <w:t xml:space="preserve">Свидетельство о государственной регистрации программы для ЭВМ.</w:t>
+            </w:r>
+          </w:p>
+          <w:p>
+            <w:pPr>
+              <w:spacing w:line="276" w:lineRule="auto"/>
+              <w:rPr>
+                <w:rFonts w:ascii="Times New Roman" w:eastAsia="Times New Roman" w:hAnsi="Times New Roman" w:cs="Times New Roman"/>
+                <w:lang w:eastAsia="ru-RU"/>
+              </w:rPr>
+            </w:pPr>
+            <w:r>
+              <w:rPr>
+                <w:rFonts w:ascii="Times New Roman" w:eastAsia="Times New Roman" w:hAnsi="Times New Roman" w:cs="Times New Roman"/>
                 <w:highlight w:val="yellow"/>
                 <w:lang w:eastAsia="ru-RU"/>
               </w:rPr>
-              <w:t xml:space="preserve">требуется ответ</w:t>
+              <w:t xml:space="preserve">Номер и дата свидетельства — требуется указать.</w:t>
             </w:r>
           </w:p>
         </w:tc>
@@ -491,10 +522,9 @@
             <w:r>
               <w:rPr>
                 <w:rFonts w:ascii="Times New Roman" w:eastAsia="Times New Roman" w:hAnsi="Times New Roman" w:cs="Times New Roman"/>
-                <w:highlight w:val="yellow"/>
-                <w:lang w:eastAsia="ru-RU"/>
-              </w:rPr>
-              <w:t xml:space="preserve">требуется ответ</w:t>
+                <w:lang w:eastAsia="ru-RU"/>
+              </w:rPr>
+              <w:t xml:space="preserve">да</w:t>
             </w:r>
           </w:p>
         </w:tc>
@@ -598,7 +628,7 @@
                 <w:highlight w:val="yellow"/>
                 <w:lang w:eastAsia="ru-RU"/>
               </w:rPr>
-              <w:t xml:space="preserve">Ссылка на сайт — требуется ответ.</w:t>
+              <w:t xml:space="preserve">Раздел с документацией на сайте правообладателя требуется создать до подачи.</w:t>
             </w:r>
           </w:p>
         </w:tc>
@@ -723,7 +753,7 @@
                 <w:highlight w:val="yellow"/>
                 <w:lang w:eastAsia="ru-RU"/>
               </w:rPr>
-              <w:t xml:space="preserve">Ссылка на сайт — требуется ответ.</w:t>
+              <w:t xml:space="preserve">Раздел с документацией на сайте правообладателя требуется создать до подачи.</w:t>
             </w:r>
           </w:p>
         </w:tc>
@@ -1350,10 +1380,9 @@
             <w:r>
               <w:rPr>
                 <w:rFonts w:ascii="Times New Roman" w:eastAsia="Times New Roman" w:hAnsi="Times New Roman" w:cs="Times New Roman"/>
-                <w:highlight w:val="yellow"/>
-                <w:lang w:eastAsia="ru-RU"/>
-              </w:rPr>
-              <w:t xml:space="preserve">требуется ответ</w:t>
+                <w:lang w:eastAsia="ru-RU"/>
+              </w:rPr>
+              <w:t xml:space="preserve">Справка от регистратора доменных имён и договор использования доменного имени.</w:t>
             </w:r>
           </w:p>
         </w:tc>
@@ -1372,10 +1401,9 @@
             <w:r>
               <w:rPr>
                 <w:rFonts w:ascii="Times New Roman" w:eastAsia="Times New Roman" w:hAnsi="Times New Roman" w:cs="Times New Roman"/>
-                <w:highlight w:val="yellow"/>
-                <w:lang w:eastAsia="ru-RU"/>
-              </w:rPr>
-              <w:t xml:space="preserve">требуется ответ</w:t>
+                <w:lang w:eastAsia="ru-RU"/>
+              </w:rPr>
+              <w:t xml:space="preserve">да</w:t>
             </w:r>
           </w:p>
         </w:tc>
@@ -1492,10 +1520,9 @@
             <w:r>
               <w:rPr>
                 <w:rFonts w:ascii="Times New Roman" w:eastAsia="Times New Roman" w:hAnsi="Times New Roman" w:cs="Times New Roman"/>
-                <w:highlight w:val="yellow"/>
-                <w:lang w:eastAsia="ru-RU"/>
-              </w:rPr>
-              <w:t xml:space="preserve">Подтверждающий документ (договор аренды либо документ о праве собственности) — требуется ответ.</w:t>
+                <w:lang w:eastAsia="ru-RU"/>
+              </w:rPr>
+              <w:t xml:space="preserve">Подтверждающий документ: договор аренды помещения по указанному адресу.</w:t>
             </w:r>
           </w:p>
         </w:tc>
@@ -1905,10 +1932,26 @@
             <w:r>
               <w:rPr>
                 <w:rFonts w:ascii="Times New Roman" w:eastAsia="Times New Roman" w:hAnsi="Times New Roman" w:cs="Times New Roman"/>
+                <w:lang w:eastAsia="ru-RU"/>
+              </w:rPr>
+              <w:t xml:space="preserve">Не оформлены.</w:t>
+            </w:r>
+          </w:p>
+          <w:p>
+            <w:pPr>
+              <w:spacing w:line="276" w:lineRule="auto"/>
+              <w:rPr>
+                <w:rFonts w:ascii="Times New Roman" w:eastAsia="Times New Roman" w:hAnsi="Times New Roman" w:cs="Times New Roman"/>
+                <w:lang w:eastAsia="ru-RU"/>
+              </w:rPr>
+            </w:pPr>
+            <w:r>
+              <w:rPr>
+                <w:rFonts w:ascii="Times New Roman" w:eastAsia="Times New Roman" w:hAnsi="Times New Roman" w:cs="Times New Roman"/>
                 <w:highlight w:val="yellow"/>
                 <w:lang w:eastAsia="ru-RU"/>
               </w:rPr>
-              <w:t xml:space="preserve">требуется ответ</w:t>
+              <w:t xml:space="preserve">Требуется подготовить: приказ о создании разработки; утверждённое техническое задание; акт о вводе в эксплуатацию; карточку учёта нематериального актива; при необходимости — договор об отчуждении исключительных прав.</w:t>
             </w:r>
           </w:p>
         </w:tc>
@@ -1927,10 +1970,9 @@
             <w:r>
               <w:rPr>
                 <w:rFonts w:ascii="Times New Roman" w:eastAsia="Times New Roman" w:hAnsi="Times New Roman" w:cs="Times New Roman"/>
-                <w:highlight w:val="yellow"/>
-                <w:lang w:eastAsia="ru-RU"/>
-              </w:rPr>
-              <w:t xml:space="preserve">требуется ответ</w:t>
+                <w:lang w:eastAsia="ru-RU"/>
+              </w:rPr>
+              <w:t xml:space="preserve">нет</w:t>
             </w:r>
           </w:p>
         </w:tc>

</xml_diff>

<commit_message>
docs: state PostgreSQL as the DBMS in the questionnaire
Verified against the server entry point: app.ts mounts only Prisma-backed
routes, so the sqlite path is not part of the running product.

Co-Authored-By: Claude Opus 5 <noreply@anthropic.com>
Claude-Session: https://claude.ai/code/session_01A41GNd7NTYjRMreRZZDvYy
</commit_message>
<xml_diff>
--- a/infosreda-anketa.docx
+++ b/infosreda-anketa.docx
@@ -3975,10 +3975,9 @@
                 <w:rFonts w:ascii="Times New Roman" w:eastAsia="Times New Roman" w:hAnsi="Times New Roman" w:cs="Times New Roman"/>
                 <w:sz w:val="24"/>
                 <w:szCs w:val="24"/>
-                <w:highlight w:val="yellow"/>
-                <w:lang w:eastAsia="ru-RU"/>
-              </w:rPr>
-              <w:t xml:space="preserve">PostgreSQL (серверная часть, доступ через Prisma) — требуется подтверждение.</w:t>
+                <w:lang w:eastAsia="ru-RU"/>
+              </w:rPr>
+              <w:t xml:space="preserve">PostgreSQL — серверная часть программного обеспечения (лицензионный сервер), доступ через Prisma ORM. Клиентские приложения собственной СУБД не используют: пользовательские данные хранятся в файлах на устройстве.</w:t>
             </w:r>
           </w:p>
         </w:tc>

</xml_diff>

<commit_message>
docs: correct distribution model to cover the SaaS half of the product
The web editor and admin console are browser-delivered against a
multi-tenant subscription server, so the questionnaire must claim both
SaaS and customer-side deployment, not the latter alone.

Co-Authored-By: Claude Opus 5 <noreply@anthropic.com>
Claude-Session: https://claude.ai/code/session_01A41GNd7NTYjRMreRZZDvYy
</commit_message>
<xml_diff>
--- a/infosreda-anketa.docx
+++ b/infosreda-anketa.docx
@@ -3429,7 +3429,35 @@
                 <w:szCs w:val="24"/>
                 <w:lang w:eastAsia="ru-RU"/>
               </w:rPr>
-              <w:t xml:space="preserve">Размещение в инфраструктуре заказчика. Как интернет-сервис (SaaS) ПО не распространяется.</w:t>
+              <w:t xml:space="preserve">Применяются оба способа.</w:t>
+            </w:r>
+          </w:p>
+          <w:p>
+            <w:pPr>
+              <w:spacing w:line="276" w:lineRule="auto" w:before="0" w:after="0"/>
+            </w:pPr>
+            <w:r>
+              <w:rPr>
+                <w:rFonts w:ascii="Times New Roman" w:eastAsia="Times New Roman" w:hAnsi="Times New Roman" w:cs="Times New Roman"/>
+                <w:sz w:val="24"/>
+                <w:szCs w:val="24"/>
+                <w:lang w:eastAsia="ru-RU"/>
+              </w:rPr>
+              <w:t xml:space="preserve">Интернет-сервис (SaaS): веб-редактор контента и кабинет администратора предоставляются через браузер на сервере правообладателя. Проекты, медиафайлы, учётные записи и лицензии хранятся на стороне сервера; доступ — по учётной записи либо по лицензионному ключу. Лицензии оформляются как подписки с тарифными планами.</w:t>
+            </w:r>
+          </w:p>
+          <w:p>
+            <w:pPr>
+              <w:spacing w:line="276" w:lineRule="auto" w:before="0" w:after="0"/>
+            </w:pPr>
+            <w:r>
+              <w:rPr>
+                <w:rFonts w:ascii="Times New Roman" w:eastAsia="Times New Roman" w:hAnsi="Times New Roman" w:cs="Times New Roman"/>
+                <w:sz w:val="24"/>
+                <w:szCs w:val="24"/>
+                <w:lang w:eastAsia="ru-RU"/>
+              </w:rPr>
+              <w:t xml:space="preserve">Размещение в инфраструктуре заказчика: плеер и настольный редактор контента устанавливаются на оборудование заказчика (интерактивные панели, столы, доски, персональные компьютеры) и работают автономно.</w:t>
             </w:r>
           </w:p>
         </w:tc>
@@ -3481,7 +3509,7 @@
                 <w:szCs w:val="24"/>
                 <w:lang w:eastAsia="ru-RU"/>
               </w:rPr>
-              <w:t xml:space="preserve">Microsoft Windows 10 и новее (установочный пакет формата NSIS, архитектура x64).</w:t>
+              <w:t xml:space="preserve">Настольные приложения: Microsoft Windows 10 и новее (установочный пакет формата NSIS, архитектура x64); операционные системы семейства Linux (пакеты форматов deb и rpm, архитектуры x64 и arm64). Windows 7, 8 и 8.1 не поддерживаются.</w:t>
             </w:r>
           </w:p>
           <w:p>
@@ -3495,7 +3523,7 @@
                 <w:szCs w:val="24"/>
                 <w:lang w:eastAsia="ru-RU"/>
               </w:rPr>
-              <w:t xml:space="preserve">Операционные системы семейства Linux (пакеты форматов deb и rpm, архитектуры x64 и arm64).</w:t>
+              <w:t xml:space="preserve">Серверная часть: операционные системы семейства Linux.</w:t>
             </w:r>
           </w:p>
           <w:p>
@@ -3509,7 +3537,7 @@
                 <w:szCs w:val="24"/>
                 <w:lang w:eastAsia="ru-RU"/>
               </w:rPr>
-              <w:t xml:space="preserve">Windows 7, 8 и 8.1 не поддерживаются.</w:t>
+              <w:t xml:space="preserve">Веб-приложения (редактор контента, кабинет администратора): выполняются в браузере, от операционной системы не зависят.</w:t>
             </w:r>
           </w:p>
         </w:tc>
@@ -3717,7 +3745,21 @@
                 <w:szCs w:val="24"/>
                 <w:lang w:eastAsia="ru-RU"/>
               </w:rPr>
-              <w:t xml:space="preserve">Локальная файловая система устройства (пользовательские данные, учебный контент, медиафайлы); на серверной части — реляционная СУБД.</w:t>
+              <w:t xml:space="preserve">Серверная часть: реляционная СУБД (учётные записи, организации, лицензии, устройства, проекты) и файловое хранилище сервера (файлы проектов и медиафайлы).</w:t>
+            </w:r>
+          </w:p>
+          <w:p>
+            <w:pPr>
+              <w:spacing w:line="276" w:lineRule="auto" w:before="0" w:after="0"/>
+            </w:pPr>
+            <w:r>
+              <w:rPr>
+                <w:rFonts w:ascii="Times New Roman" w:eastAsia="Times New Roman" w:hAnsi="Times New Roman" w:cs="Times New Roman"/>
+                <w:sz w:val="24"/>
+                <w:szCs w:val="24"/>
+                <w:lang w:eastAsia="ru-RU"/>
+              </w:rPr>
+              <w:t xml:space="preserve">Оборудование заказчика: локальная файловая система устройства (пользовательские данные, учебный контент, медиафайлы).</w:t>
             </w:r>
           </w:p>
         </w:tc>
@@ -3821,7 +3863,7 @@
                 <w:szCs w:val="24"/>
                 <w:lang w:eastAsia="ru-RU"/>
               </w:rPr>
-              <w:t xml:space="preserve">Встроенный веб-сервер на основе Node.js (Express) в составе ПО; внешний веб-сервер не требуется.</w:t>
+              <w:t xml:space="preserve">Встроенный веб-сервер на основе Node.js (Express) в составе серверной части: обслуживает программные интерфейсы и веб-приложения (редактор контента, кабинет администратора). Внешний веб-сервер не требуется.</w:t>
             </w:r>
           </w:p>
         </w:tc>

</xml_diff>

<commit_message>
docs: record the rented VPS as the compilation and object code location
Builds are produced by the server component, which runs on a rented VPS,
so claiming compilation happens on company premises was wrong. Both
documents now name the hosting provider and carry the data centre address
as an open item.

Co-Authored-By: Claude Opus 5 <noreply@anthropic.com>
Claude-Session: https://claude.ai/code/session_01A41GNd7NTYjRMreRZZDvYy
</commit_message>
<xml_diff>
--- a/infosreda-anketa.docx
+++ b/infosreda-anketa.docx
@@ -1506,23 +1506,40 @@
                 <w:rFonts w:ascii="Times New Roman" w:eastAsia="Times New Roman" w:hAnsi="Times New Roman" w:cs="Times New Roman"/>
                 <w:lang w:eastAsia="ru-RU"/>
               </w:rPr>
-              <w:t xml:space="preserve">Адрес нахождения технических средств: Россия, 188300, Ленинградская обл., Гатчинский р-н, г.п. Гатчинское, г. Гатчина, ул. 7-й Армии, д. 24, пом. 2.</w:t>
-            </w:r>
-          </w:p>
-          <w:p>
-            <w:pPr>
-              <w:spacing w:line="276" w:lineRule="auto"/>
-              <w:rPr>
-                <w:rFonts w:ascii="Times New Roman" w:eastAsia="Times New Roman" w:hAnsi="Times New Roman" w:cs="Times New Roman"/>
-                <w:lang w:eastAsia="ru-RU"/>
-              </w:rPr>
-            </w:pPr>
-            <w:r>
-              <w:rPr>
-                <w:rFonts w:ascii="Times New Roman" w:eastAsia="Times New Roman" w:hAnsi="Times New Roman" w:cs="Times New Roman"/>
-                <w:lang w:eastAsia="ru-RU"/>
-              </w:rPr>
-              <w:t xml:space="preserve">Подтверждающий документ: договор аренды помещения по указанному адресу.</w:t>
+              <w:t xml:space="preserve">Адреса нахождения технических средств:</w:t>
+            </w:r>
+          </w:p>
+          <w:p>
+            <w:pPr>
+              <w:spacing w:line="276" w:lineRule="auto"/>
+              <w:rPr>
+                <w:rFonts w:ascii="Times New Roman" w:eastAsia="Times New Roman" w:hAnsi="Times New Roman" w:cs="Times New Roman"/>
+                <w:lang w:eastAsia="ru-RU"/>
+              </w:rPr>
+            </w:pPr>
+            <w:r>
+              <w:rPr>
+                <w:rFonts w:ascii="Times New Roman" w:eastAsia="Times New Roman" w:hAnsi="Times New Roman" w:cs="Times New Roman"/>
+                <w:lang w:eastAsia="ru-RU"/>
+              </w:rPr>
+              <w:t xml:space="preserve">— хранение исходного текста: Россия, 188300, Ленинградская обл., Гатчинский р-н, г.п. Гатчинское, г. Гатчина, ул. 7-й Армии, д. 24, пом. 2; подтверждающий документ — договор аренды помещения;</w:t>
+            </w:r>
+          </w:p>
+          <w:p>
+            <w:pPr>
+              <w:spacing w:line="276" w:lineRule="auto"/>
+              <w:rPr>
+                <w:rFonts w:ascii="Times New Roman" w:eastAsia="Times New Roman" w:hAnsi="Times New Roman" w:cs="Times New Roman"/>
+                <w:lang w:eastAsia="ru-RU"/>
+              </w:rPr>
+            </w:pPr>
+            <w:r>
+              <w:rPr>
+                <w:rFonts w:ascii="Times New Roman" w:eastAsia="Times New Roman" w:hAnsi="Times New Roman" w:cs="Times New Roman"/>
+                <w:highlight w:val="yellow"/>
+                <w:lang w:eastAsia="ru-RU"/>
+              </w:rPr>
+              <w:t xml:space="preserve">— компиляция исходного текста, хранение объектного кода и работа серверной части: арендованный виртуальный сервер (VPS) провайдера Hostkey, центр обработки данных на территории Российской Федерации, адрес — указать по договору; подтверждающий документ — договор (пользовательское соглашение) с провайдером.</w:t>
             </w:r>
           </w:p>
         </w:tc>

</xml_diff>

<commit_message>
docs: state the valuation purpose and reconcile the approaches by weight
The valuation supports the price in an assignment agreement, so the
document now fixes the object, purpose and value type up front, and the
reconciliation shows the weight grid and its sensitivity instead of an
open-ended range. Questionnaire updated: the assignment agreement exists.

Co-Authored-By: Claude Opus 5 <noreply@anthropic.com>
Claude-Session: https://claude.ai/code/session_01A41GNd7NTYjRMreRZZDvYy
</commit_message>
<xml_diff>
--- a/infosreda-anketa.docx
+++ b/infosreda-anketa.docx
@@ -1951,7 +1951,23 @@
                 <w:rFonts w:ascii="Times New Roman" w:eastAsia="Times New Roman" w:hAnsi="Times New Roman" w:cs="Times New Roman"/>
                 <w:lang w:eastAsia="ru-RU"/>
               </w:rPr>
-              <w:t xml:space="preserve">Не оформлены.</w:t>
+              <w:t xml:space="preserve">Оформлены частично.</w:t>
+            </w:r>
+          </w:p>
+          <w:p>
+            <w:pPr>
+              <w:spacing w:line="276" w:lineRule="auto"/>
+              <w:rPr>
+                <w:rFonts w:ascii="Times New Roman" w:eastAsia="Times New Roman" w:hAnsi="Times New Roman" w:cs="Times New Roman"/>
+                <w:lang w:eastAsia="ru-RU"/>
+              </w:rPr>
+            </w:pPr>
+            <w:r>
+              <w:rPr>
+                <w:rFonts w:ascii="Times New Roman" w:eastAsia="Times New Roman" w:hAnsi="Times New Roman" w:cs="Times New Roman"/>
+                <w:lang w:eastAsia="ru-RU"/>
+              </w:rPr>
+              <w:t xml:space="preserve">Договор об отчуждении исключительного права — подготовлен.</w:t>
             </w:r>
           </w:p>
           <w:p>
@@ -1968,7 +1984,7 @@
                 <w:highlight w:val="yellow"/>
                 <w:lang w:eastAsia="ru-RU"/>
               </w:rPr>
-              <w:t xml:space="preserve">Требуется подготовить: приказ о создании разработки; утверждённое техническое задание; акт о вводе в эксплуатацию; карточку учёта нематериального актива; при необходимости — договор об отчуждении исключительных прав.</w:t>
+              <w:t xml:space="preserve">Требуется подготовить: приказ о создании разработки; утверждённое техническое задание; акт о вводе в эксплуатацию; карточку учёта нематериального актива.</w:t>
             </w:r>
           </w:p>
         </w:tc>
@@ -1989,7 +2005,7 @@
                 <w:rFonts w:ascii="Times New Roman" w:eastAsia="Times New Roman" w:hAnsi="Times New Roman" w:cs="Times New Roman"/>
                 <w:lang w:eastAsia="ru-RU"/>
               </w:rPr>
-              <w:t xml:space="preserve">нет</w:t>
+              <w:t xml:space="preserve">частично</w:t>
             </w:r>
           </w:p>
         </w:tc>

</xml_diff>